<commit_message>
docs: corregir a catorce tablas el Documento de Diseño y citar la migración V1
Co-Authored-By: Claude Opus 5.5 <noreply@anthropic.com>
Claude-Session: https://claude.ai/code/session_019yAiQ6SJ8faHeryAa6w9Vi
</commit_message>
<xml_diff>
--- a/Fase 2/Evidencias Proyecto (version Agil)/Documento 05 - Documento de Diseño.docx
+++ b/Fase 2/Evidencias Proyecto (version Agil)/Documento 05 - Documento de Diseño.docx
@@ -3624,7 +3624,16 @@
         <w:jc w:val="both"/>
       </w:pPr>
       <w:r>
-        <w:t>El modelo relacional tiene trece tablas. Las decisiones que lo explican son cinco:</w:t>
+        <w:t>El modelo relacional tiene catorce tablas, creadas por la migración V1_</w:t>
+      </w:r>
+      <w:r>
+        <w:rPr>
+          <w:i/>
+        </w:rPr>
+        <w:t>esquema</w:t>
+      </w:r>
+      <w:r>
+        <w:t>inicial.sql y verificadas con una prueba automatizada contra PostgreSQL 16. Las decisiones que lo explican son cinco:</w:t>
       </w:r>
     </w:p>
     <w:p>

</xml_diff>